<commit_message>
fix(session): read page Metadata rows in both name forms; perfil is a text page
aem.page writes <meta name="session-redirect">, the editing tool preview keeps
the authored name (<meta name="Session Redirect">): readPageMetadata accepts
both, so Session / Session Redirect work in the preview too. content-drive
perfil.docx is now only a profile text (Session: required).

Co-Authored-By: Claude Opus 5.5 (1M context) <noreply@anthropic.com>
</commit_message>
<xml_diff>
--- a/content-drive/perfil.docx
+++ b/content-drive/perfil.docx
@@ -12,121 +12,9 @@
     </w:p>
     <w:p>
       <w:r>
-        <w:t xml:space="preserve">Esta página solo se ve con sesión. Sin sesión te lleva al inicio de sesión y, al entrar, regresas aquí.</w:t>
+        <w:t xml:space="preserve">Aquí verás los datos de tu cuenta NovaMóvil.</w:t>
       </w:r>
     </w:p>
-    <w:tbl>
-      <w:tblPr>
-        <w:tblW w:w="9360" w:type="dxa"/>
-        <w:tblLayout w:type="fixed"/>
-        <w:tblBorders>
-          <w:top w:val="single" w:sz="4" w:color="999999"/>
-          <w:left w:val="single" w:sz="4" w:color="999999"/>
-          <w:bottom w:val="single" w:sz="4" w:color="999999"/>
-          <w:right w:val="single" w:sz="4" w:color="999999"/>
-          <w:insideH w:val="single" w:sz="4" w:color="999999"/>
-          <w:insideV w:val="single" w:sz="4" w:color="999999"/>
-        </w:tblBorders>
-      </w:tblPr>
-      <w:tblGrid>
-        <w:gridCol w:w="2160"/>
-        <w:gridCol w:w="7200"/>
-      </w:tblGrid>
-      <w:tr>
-        <w:tc>
-          <w:tcPr>
-            <w:tcW w:w="9360" w:type="dxa"/>
-            <w:gridSpan w:val="2"/>
-          </w:tcPr>
-          <w:p>
-            <w:r>
-              <w:t xml:space="preserve">Block Session Example</w:t>
-            </w:r>
-          </w:p>
-        </w:tc>
-      </w:tr>
-      <w:tr>
-        <w:tc>
-          <w:tcPr>
-            <w:tcW w:w="2160" w:type="dxa"/>
-          </w:tcPr>
-          <w:p>
-            <w:r>
-              <w:t xml:space="preserve">Styles</w:t>
-            </w:r>
-          </w:p>
-        </w:tc>
-        <w:tc>
-          <w:tcPr>
-            <w:tcW w:w="7200" w:type="dxa"/>
-          </w:tcPr>
-          <w:p/>
-        </w:tc>
-      </w:tr>
-      <w:tr>
-        <w:tc>
-          <w:tcPr>
-            <w:tcW w:w="2160" w:type="dxa"/>
-          </w:tcPr>
-          <w:p>
-            <w:r>
-              <w:t xml:space="preserve">Classname</w:t>
-            </w:r>
-          </w:p>
-        </w:tc>
-        <w:tc>
-          <w:tcPr>
-            <w:tcW w:w="7200" w:type="dxa"/>
-          </w:tcPr>
-          <w:p/>
-        </w:tc>
-      </w:tr>
-      <w:tr>
-        <w:tc>
-          <w:tcPr>
-            <w:tcW w:w="2160" w:type="dxa"/>
-          </w:tcPr>
-          <w:p>
-            <w:r>
-              <w:t xml:space="preserve">Signed In Text</w:t>
-            </w:r>
-          </w:p>
-        </w:tc>
-        <w:tc>
-          <w:tcPr>
-            <w:tcW w:w="7200" w:type="dxa"/>
-          </w:tcPr>
-          <w:p>
-            <w:r>
-              <w:t xml:space="preserve">Hola, {name}. Este es tu perfil.</w:t>
-            </w:r>
-          </w:p>
-        </w:tc>
-      </w:tr>
-      <w:tr>
-        <w:tc>
-          <w:tcPr>
-            <w:tcW w:w="2160" w:type="dxa"/>
-          </w:tcPr>
-          <w:p>
-            <w:r>
-              <w:t xml:space="preserve">Sign Out Text</w:t>
-            </w:r>
-          </w:p>
-        </w:tc>
-        <w:tc>
-          <w:tcPr>
-            <w:tcW w:w="7200" w:type="dxa"/>
-          </w:tcPr>
-          <w:p>
-            <w:r>
-              <w:t xml:space="preserve">Cerrar sesión</w:t>
-            </w:r>
-          </w:p>
-        </w:tc>
-      </w:tr>
-    </w:tbl>
-    <w:p/>
     <w:tbl>
       <w:tblPr>
         <w:tblW w:w="9360" w:type="dxa"/>

</xml_diff>

<commit_message>
feat(session): page Metadata Session true/false and Redirect With Session
Page rule (guardPage, global, no block code): Metadata "Session" = true
protects the page (case-insensitive); false, empty or no row = public. A
visitor without session (guest included) goes to "Redirect With Session"
with ?redirect= back to the page, or to the home page (/) when the row is
missing. Replaces Session required|guest and Session Redirect.
perfil.docx uses Session true + Redirect With Session /login; guide 08 and
foundations README updated.

Co-Authored-By: Claude Opus 5.5 (1M context) <noreply@anthropic.com>
</commit_message>
<xml_diff>
--- a/content-drive/perfil.docx
+++ b/content-drive/perfil.docx
@@ -106,19 +106,19 @@
           </w:tcPr>
           <w:p>
             <w:r>
-              <w:t xml:space="preserve">required</w:t>
-            </w:r>
-          </w:p>
-        </w:tc>
-      </w:tr>
-      <w:tr>
-        <w:tc>
-          <w:tcPr>
-            <w:tcW w:w="2160" w:type="dxa"/>
-          </w:tcPr>
-          <w:p>
-            <w:r>
-              <w:t xml:space="preserve">Session Redirect</w:t>
+              <w:t xml:space="preserve">true</w:t>
+            </w:r>
+          </w:p>
+        </w:tc>
+      </w:tr>
+      <w:tr>
+        <w:tc>
+          <w:tcPr>
+            <w:tcW w:w="2160" w:type="dxa"/>
+          </w:tcPr>
+          <w:p>
+            <w:r>
+              <w:t xml:space="preserve">Redirect With Session</w:t>
             </w:r>
           </w:p>
         </w:tc>

</xml_diff>